<commit_message>
Documentación oficial y Autor en los documentos
</commit_message>
<xml_diff>
--- a/docs/Manual_Tecnico_Coodetrans_Gestion.docx
+++ b/docs/Manual_Tecnico_Coodetrans_Gestion.docx
@@ -131,7 +131,21 @@
           <w:sz w:val="20"/>
           <w:szCs w:val="20"/>
         </w:rPr>
-        <w:t xml:space="preserve">Autor principal: Julian Ricardo Marcillo Tobar</w:t>
+        <w:t xml:space="preserve">Autor original del software: Julian Ricardo Marcillo Tobar — C.C. 1080041352</w:t>
+      </w:r>
+    </w:p>
+    <w:p>
+      <w:pPr>
+        <w:jc w:val="center"/>
+      </w:pPr>
+      <w:r>
+        <w:rPr>
+          <w:rFonts w:ascii="Calibri" w:cs="Calibri" w:eastAsia="Calibri" w:hAnsi="Calibri"/>
+          <w:color w:val="5B6B73"/>
+          <w:sz w:val="20"/>
+          <w:szCs w:val="20"/>
+        </w:rPr>
+        <w:t xml:space="preserve">GitHub: RickLabs</w:t>
       </w:r>
     </w:p>
     <w:p>
@@ -370,6 +384,281 @@
                 <w:szCs w:val="20"/>
               </w:rPr>
               <w:t xml:space="preserve">Versión inicial del manual técnico, basada en el código fuente v1.1.3.</w:t>
+            </w:r>
+          </w:p>
+        </w:tc>
+      </w:tr>
+    </w:tbl>
+    <w:p>
+      <w:pPr>
+        <w:pStyle w:val="Heading2"/>
+        <w:spacing w:after="150" w:before="300"/>
+      </w:pPr>
+      <w:r>
+        <w:t xml:space="preserve">Autoría del software</w:t>
+      </w:r>
+    </w:p>
+    <w:tbl>
+      <w:tblPr>
+        <w:tblW w:type="dxa" w:w="9350"/>
+        <w:tblBorders>
+          <w:top w:val="single" w:color="BFC9CC" w:sz="2"/>
+          <w:left w:val="single" w:color="BFC9CC" w:sz="2"/>
+          <w:bottom w:val="single" w:color="BFC9CC" w:sz="2"/>
+          <w:right w:val="single" w:color="BFC9CC" w:sz="2"/>
+          <w:insideH w:val="single" w:color="BFC9CC" w:sz="2"/>
+          <w:insideV w:val="single" w:color="BFC9CC" w:sz="2"/>
+        </w:tblBorders>
+      </w:tblPr>
+      <w:tblGrid>
+        <w:gridCol w:w="3800"/>
+        <w:gridCol w:w="5550"/>
+      </w:tblGrid>
+      <w:tr>
+        <w:trPr>
+          <w:tblHeader/>
+        </w:trPr>
+        <w:tc>
+          <w:tcPr>
+            <w:tcW w:type="dxa" w:w="3800"/>
+            <w:shd w:fill="1F4E5F" w:val="clear"/>
+            <w:tcMar>
+              <w:top w:type="dxa" w:w="80"/>
+              <w:left w:type="dxa" w:w="100"/>
+              <w:bottom w:type="dxa" w:w="80"/>
+              <w:right w:type="dxa" w:w="100"/>
+            </w:tcMar>
+            <w:vAlign w:val="center"/>
+          </w:tcPr>
+          <w:p>
+            <w:r>
+              <w:rPr>
+                <w:rFonts w:ascii="Calibri" w:cs="Calibri" w:eastAsia="Calibri" w:hAnsi="Calibri"/>
+                <w:b/>
+                <w:bCs/>
+                <w:color w:val="FFFFFF"/>
+                <w:sz w:val="20"/>
+                <w:szCs w:val="20"/>
+              </w:rPr>
+              <w:t xml:space="preserve">Campo</w:t>
+            </w:r>
+          </w:p>
+        </w:tc>
+        <w:tc>
+          <w:tcPr>
+            <w:tcW w:type="dxa" w:w="5550"/>
+            <w:shd w:fill="1F4E5F" w:val="clear"/>
+            <w:tcMar>
+              <w:top w:type="dxa" w:w="80"/>
+              <w:left w:type="dxa" w:w="100"/>
+              <w:bottom w:type="dxa" w:w="80"/>
+              <w:right w:type="dxa" w:w="100"/>
+            </w:tcMar>
+            <w:vAlign w:val="center"/>
+          </w:tcPr>
+          <w:p>
+            <w:r>
+              <w:rPr>
+                <w:rFonts w:ascii="Calibri" w:cs="Calibri" w:eastAsia="Calibri" w:hAnsi="Calibri"/>
+                <w:b/>
+                <w:bCs/>
+                <w:color w:val="FFFFFF"/>
+                <w:sz w:val="20"/>
+                <w:szCs w:val="20"/>
+              </w:rPr>
+              <w:t xml:space="preserve">Dato</w:t>
+            </w:r>
+          </w:p>
+        </w:tc>
+      </w:tr>
+      <w:tr>
+        <w:tc>
+          <w:tcPr>
+            <w:tcW w:type="dxa" w:w="3800"/>
+            <w:shd w:fill="FFFFFF" w:val="clear"/>
+            <w:tcMar>
+              <w:top w:type="dxa" w:w="70"/>
+              <w:left w:type="dxa" w:w="100"/>
+              <w:bottom w:type="dxa" w:w="70"/>
+              <w:right w:type="dxa" w:w="100"/>
+            </w:tcMar>
+            <w:vAlign w:val="center"/>
+          </w:tcPr>
+          <w:p>
+            <w:r>
+              <w:rPr>
+                <w:rFonts w:ascii="Calibri" w:cs="Calibri" w:eastAsia="Calibri" w:hAnsi="Calibri"/>
+                <w:sz w:val="20"/>
+                <w:szCs w:val="20"/>
+              </w:rPr>
+              <w:t xml:space="preserve">Autor original del software</w:t>
+            </w:r>
+          </w:p>
+        </w:tc>
+        <w:tc>
+          <w:tcPr>
+            <w:tcW w:type="dxa" w:w="5550"/>
+            <w:shd w:fill="FFFFFF" w:val="clear"/>
+            <w:tcMar>
+              <w:top w:type="dxa" w:w="70"/>
+              <w:left w:type="dxa" w:w="100"/>
+              <w:bottom w:type="dxa" w:w="70"/>
+              <w:right w:type="dxa" w:w="100"/>
+            </w:tcMar>
+            <w:vAlign w:val="center"/>
+          </w:tcPr>
+          <w:p>
+            <w:r>
+              <w:rPr>
+                <w:rFonts w:ascii="Calibri" w:cs="Calibri" w:eastAsia="Calibri" w:hAnsi="Calibri"/>
+                <w:sz w:val="20"/>
+                <w:szCs w:val="20"/>
+              </w:rPr>
+              <w:t xml:space="preserve">Julian Ricardo Marcillo Tobar</w:t>
+            </w:r>
+          </w:p>
+        </w:tc>
+      </w:tr>
+      <w:tr>
+        <w:tc>
+          <w:tcPr>
+            <w:tcW w:type="dxa" w:w="3800"/>
+            <w:shd w:fill="F5F8F9" w:val="clear"/>
+            <w:tcMar>
+              <w:top w:type="dxa" w:w="70"/>
+              <w:left w:type="dxa" w:w="100"/>
+              <w:bottom w:type="dxa" w:w="70"/>
+              <w:right w:type="dxa" w:w="100"/>
+            </w:tcMar>
+            <w:vAlign w:val="center"/>
+          </w:tcPr>
+          <w:p>
+            <w:r>
+              <w:rPr>
+                <w:rFonts w:ascii="Calibri" w:cs="Calibri" w:eastAsia="Calibri" w:hAnsi="Calibri"/>
+                <w:sz w:val="20"/>
+                <w:szCs w:val="20"/>
+              </w:rPr>
+              <w:t xml:space="preserve">Cédula de ciudadanía</w:t>
+            </w:r>
+          </w:p>
+        </w:tc>
+        <w:tc>
+          <w:tcPr>
+            <w:tcW w:type="dxa" w:w="5550"/>
+            <w:shd w:fill="F5F8F9" w:val="clear"/>
+            <w:tcMar>
+              <w:top w:type="dxa" w:w="70"/>
+              <w:left w:type="dxa" w:w="100"/>
+              <w:bottom w:type="dxa" w:w="70"/>
+              <w:right w:type="dxa" w:w="100"/>
+            </w:tcMar>
+            <w:vAlign w:val="center"/>
+          </w:tcPr>
+          <w:p>
+            <w:r>
+              <w:rPr>
+                <w:rFonts w:ascii="Calibri" w:cs="Calibri" w:eastAsia="Calibri" w:hAnsi="Calibri"/>
+                <w:sz w:val="20"/>
+                <w:szCs w:val="20"/>
+              </w:rPr>
+              <w:t xml:space="preserve">1080041352</w:t>
+            </w:r>
+          </w:p>
+        </w:tc>
+      </w:tr>
+      <w:tr>
+        <w:tc>
+          <w:tcPr>
+            <w:tcW w:type="dxa" w:w="3800"/>
+            <w:shd w:fill="FFFFFF" w:val="clear"/>
+            <w:tcMar>
+              <w:top w:type="dxa" w:w="70"/>
+              <w:left w:type="dxa" w:w="100"/>
+              <w:bottom w:type="dxa" w:w="70"/>
+              <w:right w:type="dxa" w:w="100"/>
+            </w:tcMar>
+            <w:vAlign w:val="center"/>
+          </w:tcPr>
+          <w:p>
+            <w:r>
+              <w:rPr>
+                <w:rFonts w:ascii="Calibri" w:cs="Calibri" w:eastAsia="Calibri" w:hAnsi="Calibri"/>
+                <w:sz w:val="20"/>
+                <w:szCs w:val="20"/>
+              </w:rPr>
+              <w:t xml:space="preserve">Usuario / organización en GitHub</w:t>
+            </w:r>
+          </w:p>
+        </w:tc>
+        <w:tc>
+          <w:tcPr>
+            <w:tcW w:type="dxa" w:w="5550"/>
+            <w:shd w:fill="FFFFFF" w:val="clear"/>
+            <w:tcMar>
+              <w:top w:type="dxa" w:w="70"/>
+              <w:left w:type="dxa" w:w="100"/>
+              <w:bottom w:type="dxa" w:w="70"/>
+              <w:right w:type="dxa" w:w="100"/>
+            </w:tcMar>
+            <w:vAlign w:val="center"/>
+          </w:tcPr>
+          <w:p>
+            <w:r>
+              <w:rPr>
+                <w:rFonts w:ascii="Calibri" w:cs="Calibri" w:eastAsia="Calibri" w:hAnsi="Calibri"/>
+                <w:sz w:val="20"/>
+                <w:szCs w:val="20"/>
+              </w:rPr>
+              <w:t xml:space="preserve">RickLabs</w:t>
+            </w:r>
+          </w:p>
+        </w:tc>
+      </w:tr>
+      <w:tr>
+        <w:tc>
+          <w:tcPr>
+            <w:tcW w:type="dxa" w:w="3800"/>
+            <w:shd w:fill="F5F8F9" w:val="clear"/>
+            <w:tcMar>
+              <w:top w:type="dxa" w:w="70"/>
+              <w:left w:type="dxa" w:w="100"/>
+              <w:bottom w:type="dxa" w:w="70"/>
+              <w:right w:type="dxa" w:w="100"/>
+            </w:tcMar>
+            <w:vAlign w:val="center"/>
+          </w:tcPr>
+          <w:p>
+            <w:r>
+              <w:rPr>
+                <w:rFonts w:ascii="Calibri" w:cs="Calibri" w:eastAsia="Calibri" w:hAnsi="Calibri"/>
+                <w:sz w:val="20"/>
+                <w:szCs w:val="20"/>
+              </w:rPr>
+              <w:t xml:space="preserve">Cooperativa / cliente</w:t>
+            </w:r>
+          </w:p>
+        </w:tc>
+        <w:tc>
+          <w:tcPr>
+            <w:tcW w:type="dxa" w:w="5550"/>
+            <w:shd w:fill="F5F8F9" w:val="clear"/>
+            <w:tcMar>
+              <w:top w:type="dxa" w:w="70"/>
+              <w:left w:type="dxa" w:w="100"/>
+              <w:bottom w:type="dxa" w:w="70"/>
+              <w:right w:type="dxa" w:w="100"/>
+            </w:tcMar>
+            <w:vAlign w:val="center"/>
+          </w:tcPr>
+          <w:p>
+            <w:r>
+              <w:rPr>
+                <w:rFonts w:ascii="Calibri" w:cs="Calibri" w:eastAsia="Calibri" w:hAnsi="Calibri"/>
+                <w:sz w:val="20"/>
+                <w:szCs w:val="20"/>
+              </w:rPr>
+              <w:t xml:space="preserve">Coodetrans</w:t>
             </w:r>
           </w:p>
         </w:tc>

</xml_diff>